<commit_message>
docs: New docs from Norma 220501096
</commit_message>
<xml_diff>
--- a/normas/Diagramas de Lenguaje Unificado de Modelado (UML).docx
+++ b/normas/Diagramas de Lenguaje Unificado de Modelado (UML).docx
@@ -119,7 +119,7 @@
                 <w:color w:val="37474F"/>
                 <w:sz w:val="20"/>
               </w:rPr>
-              <w:t>Tecnología en Análisis y Desarrollo de Sistemas de Información</w:t>
+              <w:t>Desarrollo de software</w:t>
             </w:r>
           </w:p>
         </w:tc>
@@ -464,7 +464,21 @@
         <w:rPr>
           <w:color w:val="37474F"/>
         </w:rPr>
-        <w:t xml:space="preserve">El diagrama de Secuencia refleja el flujo lógico del procesamiento ETL en el tiempo. Documenta gráficamente el camino paso a paso desde la extracción de archivos, las transformaciones en Pandas, hasta el cargue atómico exitoso en la base de datos y su posterior consulta </w:t>
+        <w:t xml:space="preserve">El diagrama de Secuencia refleja el flujo lógico del procesamiento ETL en el tiempo. Documenta gráficamente el camino paso a paso desde la extracción de archivos, las transformaciones en Pandas, hasta el cargue atómico exitoso en la base de datos y </w:t>
+      </w:r>
+      <w:proofErr w:type="spellStart"/>
+      <w:r>
+        <w:rPr>
+          <w:color w:val="37474F"/>
+        </w:rPr>
+        <w:t>su</w:t>
+      </w:r>
+      <w:proofErr w:type="spellEnd"/>
+      <w:r>
+        <w:rPr>
+          <w:color w:val="37474F"/>
+        </w:rPr>
+        <w:t xml:space="preserve"> posterior consulta </w:t>
       </w:r>
       <w:proofErr w:type="spellStart"/>
       <w:r>

</xml_diff>